<commit_message>
Update coauthor guide for second-season SC13 correction
</commit_message>
<xml_diff>
--- a/data/release_working/Monarch_data_release_coauthor_review.docx
+++ b/data/release_working/Monarch_data_release_coauthor_review.docx
@@ -810,7 +810,7 @@
     </w:p>
     <w:p>
       <w:r>
-        <w:t>The photo index covers 56,066 first-season JPEGs and 167,821 reviewed second-season JPEGs. Use season together with deployment_id to join the observation tables to deployments. This matters because SC12 is used in both seasons. Add image_filename when joining classifications or temperatures to the photo index. The analysis tables omit season because they contain only first-season records.</w:t>
+        <w:t>The photo index covers 56,066 first-season JPEGs and 167,821 reviewed second-season JPEGs. Deployment identifiers are unique across the release. SC12 identifies the first-season NOVA camera and BlueLake wind meter. SC13 identifies the second-season IRIS camera and RockWall wind meter, correcting the reused source label SC12. Join by deployment_id and retain season for context. Add image_filename for photo joins. Analysis tables contain first-season records only.</w:t>
       </w:r>
     </w:p>
     <w:p>
@@ -901,7 +901,7 @@
     </w:p>
     <w:p>
       <w:r>
-        <w:t>PS01 has wind observations through January 31, 2025 at 04:04, although its images continue later. SC12 has a regular wind sequence through December 23, 2024 at 12:51, followed by a 22-day gap and 69 zero-speed and zero-gust records on January 14, 2025. Those later SC12 records could reflect field or servicing conditions. We do not have enough evidence to label either endpoint a battery failure, and we have not deleted the later zeros on that assumption.</w:t>
+        <w:t>PS01 has wind observations through January 31, 2025 at 04:04, although its images continue later. SC13 has a regular wind sequence through December 23, 2024 at 12:51, followed by a 22-day gap and 69 zero-speed and zero-gust records on January 14, 2025. Those later SC13 records could reflect field or servicing conditions. We do not have enough evidence to label either endpoint a battery failure, and we have not deleted the later zeros on that assumption.</w:t>
       </w:r>
     </w:p>
     <w:p>
@@ -1087,7 +1087,7 @@
     </w:p>
     <w:p>
       <w:r>
-        <w:t>The complete local staging package currently points to the reviewed photo directories through links, avoiding a second copy of the full archive. Before final upload, the indexed JPEGs must be placed in ordinary archives with the season and deployment paths preserved. Symbolic links and unlisted source files should not be distributed. Working reconciliation records, source provenance audits and this review guide are kept outside the public observational package.</w:t>
+        <w:t>The local staging package uses directory links for most photo collections and file hard links for the renamed SC13 collection, avoiding extra copies of image bytes. Before final upload, the indexed JPEGs must be placed in ordinary archives with the season and deployment paths preserved. Symbolic links and unlisted source files should not be distributed. Working reconciliation records, source provenance audits and this review guide are kept outside the public observational package.</w:t>
       </w:r>
     </w:p>
     <w:p>

</xml_diff>

<commit_message>
Update review guide to use deployment ID alone
</commit_message>
<xml_diff>
--- a/data/release_working/Monarch_data_release_coauthor_review.docx
+++ b/data/release_working/Monarch_data_release_coauthor_review.docx
@@ -240,7 +240,7 @@
                 <w:color w:val="000000"/>
                 <w:sz w:val="19"/>
               </w:rPr>
-              <w:t>A camera deployment within a season</w:t>
+              <w:t>A camera deployment</w:t>
             </w:r>
           </w:p>
         </w:tc>
@@ -770,7 +770,7 @@
         <w:rPr>
           <w:sz w:val="20"/>
         </w:rPr>
-        <w:t>The package also contains data_dictionary.csv with definitions for all 78 data columns, metadata.xml and README.md. The photographs are organized in collections by season and deployment. This guide is a review companion, not an additional observational dataset.</w:t>
+        <w:t>The package also contains data_dictionary.csv with definitions for all 73 data columns, metadata.xml and README.md. The photographs are organized in collections by deployment. This guide is a review companion, not an additional observational dataset.</w:t>
       </w:r>
     </w:p>
     <w:p>
@@ -810,7 +810,7 @@
     </w:p>
     <w:p>
       <w:r>
-        <w:t>The photo index covers 56,066 first-season JPEGs and 167,821 reviewed second-season JPEGs. Deployment identifiers are unique across the release. SC12 identifies the first-season NOVA camera and BlueLake wind meter. SC13 identifies the second-season IRIS camera and RockWall wind meter, correcting the reused source label SC12. Join by deployment_id and retain season for context. Add image_filename for photo joins. Analysis tables contain first-season records only.</w:t>
+        <w:t>The photo index covers 56,066 first-season JPEGs and 167,821 reviewed second-season JPEGs. Deployment identifiers are unique across the release. SC12 identifies the first-season NOVA camera and BlueLake wind meter. SC13 identifies the second-season IRIS camera and RockWall wind meter, correcting the reused source label SC12. Join by deployment_id. Add image_filename for photo joins. Analysis tables contain first-season records only.</w:t>
       </w:r>
     </w:p>
     <w:p>
@@ -820,7 +820,7 @@
     </w:p>
     <w:p>
       <w:r>
-        <w:t>The folder pattern is photos/season/deployment_id/. Filenames follow deployment_id_YYYYMMDDHHMMSS.JPG. The timestamp format code is %Y%m%d%H%M%S, using a four-digit year, two-digit month and day, and 24-hour hour, minute and second. Deployment identifiers may themselves contain underscores. Second-season names use recorded EXIF capture times. Existing first-season canonical filenames are preserved.</w:t>
+        <w:t>The folder pattern is photos/deployment_id/. Filenames follow deployment_id_YYYYMMDDHHMMSS.JPG. The timestamp format code is %Y%m%d%H%M%S, using a four-digit year, two-digit month and day, and 24-hour hour, minute and second. Deployment identifiers may themselves contain underscores. Second-season names use recorded EXIF capture times. Existing first-season canonical filenames are preserved.</w:t>
       </w:r>
     </w:p>
     <w:p>
@@ -883,7 +883,7 @@
     </w:p>
     <w:p>
       <w:r>
-        <w:t>The public wind table retains season, deployment_id, wind_sensor_name, timestamp_recorded, wind_speed_m_s, wind_gust_m_s and wind_direction_degrees. Wind speed and gust are in meters per second. Gust is the logger maximum for the recording interval, normally one minute. These measurements describe conditions near the logger, rather than sustained exposure at every butterfly position.</w:t>
+        <w:t>The public wind table retains deployment_id, wind_sensor_name, timestamp_recorded, wind_speed_m_s, wind_gust_m_s and wind_direction_degrees. Wind speed and gust are in meters per second. Gust is the logger maximum for the recording interval, normally one minute. These measurements describe conditions near the logger, rather than sustained exposure at every butterfly position.</w:t>
       </w:r>
     </w:p>
     <w:p>
@@ -933,7 +933,7 @@
     </w:p>
     <w:p>
       <w:r>
-        <w:t>Each classification contains the season, deployment identifier, camera name, image filename, recorded time and observer information. It preserves counts of image cells in the 0, 1–9, 10–99 and 100–999 butterfly categories. It also preserves counts of occupied cells marked as receiving direct sunlight in each occupied category. These primitives allow readers to calculate alternative category-weighted indices without changing the original annotations.</w:t>
+        <w:t>Each classification contains the deployment identifier, camera name, image filename, recorded time and observer information. It preserves counts of image cells in the 0, 1–9, 10–99 and 100–999 butterfly categories. It also preserves counts of occupied cells marked as receiving direct sunlight in each occupied category. These primitives allow readers to calculate alternative category-weighted indices without changing the original annotations.</w:t>
       </w:r>
     </w:p>
     <w:p>
@@ -969,7 +969,7 @@
     </w:p>
     <w:p>
       <w:r>
-        <w:t>The temperature table contains 56,066 first-season records linked to image filename, recorded time, season, deployment and camera. Temperatures were extracted from the image overlays with optical character recognition, then previously reviewed and corrected where necessary. The release copies the reviewed Celsius values, including missing values, without new recalibration or clock changes. The table omits OCR confidence and processing-status columns to keep the released measurements simple.</w:t>
+        <w:t>The temperature table contains 56,066 first-season records linked to image filename, recorded time, deployment and camera. Temperatures were extracted from the image overlays with optical character recognition, then previously reviewed and corrected where necessary. The release copies the reviewed Celsius values, including missing values, without new recalibration or clock changes. The table omits OCR confidence and processing-status columns to keep the released measurements simple.</w:t>
       </w:r>
     </w:p>
     <w:p>
@@ -1059,7 +1059,7 @@
     </w:p>
     <w:p>
       <w:r>
-        <w:t>Please review whether the release scope and file descriptions accurately represent the observations, including deployments outside the manuscript subset. Check the camera and wind-meter assignments, deployment boundaries and location descriptions. The season and deployment identifiers should let a reader connect every table and photograph without relying on local knowledge of the equipment names.</w:t>
+        <w:t>Please review whether the release scope and file descriptions accurately represent the observations, including deployments outside the manuscript subset. Check the camera and wind-meter assignments, deployment boundaries and location descriptions. The deployment identifiers should let a reader connect every table and photograph without relying on local knowledge of the equipment names.</w:t>
       </w:r>
     </w:p>
     <w:p>
@@ -1087,7 +1087,7 @@
     </w:p>
     <w:p>
       <w:r>
-        <w:t>The local staging package uses directory links for most photo collections and file hard links for the renamed SC13 collection, avoiding extra copies of image bytes. Before final upload, the indexed JPEGs must be placed in ordinary archives with the season and deployment paths preserved. Symbolic links and unlisted source files should not be distributed. Working reconciliation records, source provenance audits and this review guide are kept outside the public observational package.</w:t>
+        <w:t>The local staging package uses directory links for most photo collections and file hard links for the renamed SC13 collection, avoiding extra copies of image bytes. Before final upload, the indexed JPEGs must be placed in ordinary archives with the deployment paths preserved. Symbolic links and unlisted source files should not be distributed. Working reconciliation records, source provenance audits and this review guide are kept outside the public observational package.</w:t>
       </w:r>
     </w:p>
     <w:p>

</xml_diff>